<commit_message>
add user model and update .docx
</commit_message>
<xml_diff>
--- a/Online Judge.docx
+++ b/Online Judge.docx
@@ -104,17 +104,7 @@
           <w:sz w:val="22"/>
           <w:szCs w:val="22"/>
         </w:rPr>
-        <w:t xml:space="preserve">An online judge is a platform where users can practice </w:t>
-      </w:r>
-      <w:bookmarkStart w:id="0" w:name="_GoBack"/>
-      <w:bookmarkEnd w:id="0"/>
-      <w:r>
-        <w:rPr>
-          <w:rFonts w:asciiTheme="minorHAnsi" w:hAnsiTheme="minorHAnsi" w:cstheme="minorHAnsi"/>
-          <w:sz w:val="22"/>
-          <w:szCs w:val="22"/>
-        </w:rPr>
-        <w:t>and improve their programming skills by solving coding problems. Participants submit their solutions, which are automatically evaluated against a set of hidden test cases to verify correctness and effi</w:t>
+        <w:t>An online judge is a platform where users can practice and improve their programming skills by solving coding problems. Participants submit their solutions, which are automatically evaluated against a set of hidden test cases to verify correctness and effi</w:t>
       </w:r>
       <w:r>
         <w:rPr>
@@ -2339,7 +2329,6 @@
         </w:numPr>
         <w:rPr>
           <w:rFonts w:asciiTheme="minorHAnsi" w:hAnsiTheme="minorHAnsi" w:cstheme="minorHAnsi"/>
-          <w:b/>
           <w:sz w:val="22"/>
           <w:szCs w:val="22"/>
         </w:rPr>
@@ -2352,44 +2341,12 @@
         </w:rPr>
         <w:t>password: string</w:t>
       </w:r>
-    </w:p>
-    <w:p>
-      <w:pPr>
-        <w:pStyle w:val="BodyText"/>
-        <w:numPr>
-          <w:ilvl w:val="0"/>
-          <w:numId w:val="14"/>
-        </w:numPr>
-        <w:rPr>
-          <w:rFonts w:asciiTheme="minorHAnsi" w:hAnsiTheme="minorHAnsi" w:cstheme="minorHAnsi"/>
-          <w:b/>
-          <w:sz w:val="22"/>
-          <w:szCs w:val="22"/>
-        </w:rPr>
-      </w:pPr>
-      <w:r>
-        <w:rPr>
-          <w:rFonts w:asciiTheme="minorHAnsi" w:hAnsiTheme="minorHAnsi" w:cstheme="minorHAnsi"/>
-          <w:sz w:val="22"/>
-          <w:szCs w:val="22"/>
-        </w:rPr>
-        <w:t xml:space="preserve">submissions: array of </w:t>
-      </w:r>
-      <w:proofErr w:type="spellStart"/>
-      <w:r>
-        <w:rPr>
-          <w:rFonts w:asciiTheme="minorHAnsi" w:hAnsiTheme="minorHAnsi" w:cstheme="minorHAnsi"/>
-          <w:sz w:val="22"/>
-          <w:szCs w:val="22"/>
-        </w:rPr>
-        <w:t>submission_id</w:t>
-      </w:r>
-      <w:proofErr w:type="spellEnd"/>
-    </w:p>
-    <w:p>
-      <w:pPr>
-        <w:pStyle w:val="BodyText"/>
-        <w:ind w:left="720"/>
+      <w:bookmarkStart w:id="0" w:name="_GoBack"/>
+      <w:bookmarkEnd w:id="0"/>
+    </w:p>
+    <w:p>
+      <w:pPr>
+        <w:pStyle w:val="BodyText"/>
         <w:rPr>
           <w:rFonts w:asciiTheme="minorHAnsi" w:hAnsiTheme="minorHAnsi" w:cstheme="minorHAnsi"/>
           <w:sz w:val="22"/>
@@ -3163,7 +3120,6 @@
           <w:sz w:val="22"/>
           <w:szCs w:val="22"/>
         </w:rPr>
-        <w:lastRenderedPageBreak/>
         <w:t>Verdict</w:t>
       </w:r>
     </w:p>

</xml_diff>

<commit_message>
docs: update HLD and README with project link and deployment architecture
</commit_message>
<xml_diff>
--- a/Online Judge.docx
+++ b/Online Judge.docx
@@ -2341,8 +2341,28 @@
         </w:rPr>
         <w:t>password: string</w:t>
       </w:r>
-      <w:bookmarkStart w:id="0" w:name="_GoBack"/>
-      <w:bookmarkEnd w:id="0"/>
+    </w:p>
+    <w:p>
+      <w:pPr>
+        <w:pStyle w:val="BodyText"/>
+        <w:numPr>
+          <w:ilvl w:val="0"/>
+          <w:numId w:val="14"/>
+        </w:numPr>
+        <w:rPr>
+          <w:rFonts w:asciiTheme="minorHAnsi" w:hAnsiTheme="minorHAnsi" w:cstheme="minorHAnsi"/>
+          <w:sz w:val="22"/>
+          <w:szCs w:val="22"/>
+        </w:rPr>
+      </w:pPr>
+      <w:r>
+        <w:rPr>
+          <w:rFonts w:asciiTheme="minorHAnsi" w:hAnsiTheme="minorHAnsi" w:cstheme="minorHAnsi"/>
+          <w:sz w:val="22"/>
+          <w:szCs w:val="22"/>
+        </w:rPr>
+        <w:t>user: ‘admin’ or ‘user’</w:t>
+      </w:r>
     </w:p>
     <w:p>
       <w:pPr>
@@ -2427,6 +2447,126 @@
     <w:p>
       <w:pPr>
         <w:pStyle w:val="BodyText"/>
+        <w:numPr>
+          <w:ilvl w:val="0"/>
+          <w:numId w:val="8"/>
+        </w:numPr>
+        <w:rPr>
+          <w:rFonts w:asciiTheme="minorHAnsi" w:hAnsiTheme="minorHAnsi" w:cstheme="minorHAnsi"/>
+          <w:b/>
+          <w:sz w:val="22"/>
+          <w:szCs w:val="22"/>
+        </w:rPr>
+      </w:pPr>
+      <w:proofErr w:type="spellStart"/>
+      <w:r>
+        <w:rPr>
+          <w:rFonts w:asciiTheme="minorHAnsi" w:hAnsiTheme="minorHAnsi" w:cstheme="minorHAnsi"/>
+          <w:sz w:val="22"/>
+          <w:szCs w:val="22"/>
+        </w:rPr>
+        <w:t>timeLimit</w:t>
+      </w:r>
+      <w:proofErr w:type="spellEnd"/>
+      <w:r>
+        <w:rPr>
+          <w:rFonts w:asciiTheme="minorHAnsi" w:hAnsiTheme="minorHAnsi" w:cstheme="minorHAnsi"/>
+          <w:sz w:val="22"/>
+          <w:szCs w:val="22"/>
+        </w:rPr>
+        <w:t>: numbe</w:t>
+      </w:r>
+      <w:r>
+        <w:rPr>
+          <w:rFonts w:asciiTheme="minorHAnsi" w:hAnsiTheme="minorHAnsi" w:cstheme="minorHAnsi"/>
+          <w:sz w:val="22"/>
+          <w:szCs w:val="22"/>
+        </w:rPr>
+        <w:t>r</w:t>
+      </w:r>
+    </w:p>
+    <w:p>
+      <w:pPr>
+        <w:pStyle w:val="BodyText"/>
+        <w:numPr>
+          <w:ilvl w:val="0"/>
+          <w:numId w:val="8"/>
+        </w:numPr>
+        <w:rPr>
+          <w:rFonts w:asciiTheme="minorHAnsi" w:hAnsiTheme="minorHAnsi" w:cstheme="minorHAnsi"/>
+          <w:b/>
+          <w:sz w:val="22"/>
+          <w:szCs w:val="22"/>
+        </w:rPr>
+      </w:pPr>
+      <w:proofErr w:type="spellStart"/>
+      <w:r>
+        <w:rPr>
+          <w:rFonts w:asciiTheme="minorHAnsi" w:hAnsiTheme="minorHAnsi" w:cstheme="minorHAnsi"/>
+          <w:sz w:val="22"/>
+          <w:szCs w:val="22"/>
+        </w:rPr>
+        <w:t>memoryLimit</w:t>
+      </w:r>
+      <w:proofErr w:type="spellEnd"/>
+      <w:r>
+        <w:rPr>
+          <w:rFonts w:asciiTheme="minorHAnsi" w:hAnsiTheme="minorHAnsi" w:cstheme="minorHAnsi"/>
+          <w:sz w:val="22"/>
+          <w:szCs w:val="22"/>
+        </w:rPr>
+        <w:t>: number,</w:t>
+      </w:r>
+    </w:p>
+    <w:p>
+      <w:pPr>
+        <w:pStyle w:val="BodyText"/>
+        <w:numPr>
+          <w:ilvl w:val="0"/>
+          <w:numId w:val="8"/>
+        </w:numPr>
+        <w:rPr>
+          <w:rFonts w:asciiTheme="minorHAnsi" w:hAnsiTheme="minorHAnsi" w:cstheme="minorHAnsi"/>
+          <w:b/>
+          <w:sz w:val="22"/>
+          <w:szCs w:val="22"/>
+        </w:rPr>
+      </w:pPr>
+      <w:r>
+        <w:rPr>
+          <w:rFonts w:asciiTheme="minorHAnsi" w:hAnsiTheme="minorHAnsi" w:cstheme="minorHAnsi"/>
+          <w:sz w:val="22"/>
+          <w:szCs w:val="22"/>
+        </w:rPr>
+        <w:t>constraints</w:t>
+      </w:r>
+    </w:p>
+    <w:p>
+      <w:pPr>
+        <w:pStyle w:val="BodyText"/>
+        <w:numPr>
+          <w:ilvl w:val="0"/>
+          <w:numId w:val="8"/>
+        </w:numPr>
+        <w:rPr>
+          <w:rFonts w:asciiTheme="minorHAnsi" w:hAnsiTheme="minorHAnsi" w:cstheme="minorHAnsi"/>
+          <w:b/>
+          <w:sz w:val="22"/>
+          <w:szCs w:val="22"/>
+        </w:rPr>
+      </w:pPr>
+      <w:r>
+        <w:rPr>
+          <w:rFonts w:asciiTheme="minorHAnsi" w:hAnsiTheme="minorHAnsi" w:cstheme="minorHAnsi"/>
+          <w:sz w:val="22"/>
+          <w:szCs w:val="22"/>
+        </w:rPr>
+        <w:t>example test cases</w:t>
+      </w:r>
+    </w:p>
+    <w:p>
+      <w:pPr>
+        <w:pStyle w:val="BodyText"/>
         <w:rPr>
           <w:rFonts w:asciiTheme="minorHAnsi" w:hAnsiTheme="minorHAnsi" w:cstheme="minorHAnsi"/>
           <w:b/>
@@ -3032,6 +3172,7 @@
           <w:sz w:val="22"/>
           <w:szCs w:val="22"/>
         </w:rPr>
+        <w:lastRenderedPageBreak/>
         <w:t>View past submissions</w:t>
       </w:r>
     </w:p>
@@ -3267,6 +3408,14 @@
         </w:rPr>
         <w:t>POST request for submission</w:t>
       </w:r>
+      <w:r>
+        <w:rPr>
+          <w:rFonts w:asciiTheme="minorHAnsi" w:hAnsiTheme="minorHAnsi" w:cstheme="minorHAnsi"/>
+          <w:sz w:val="22"/>
+          <w:szCs w:val="22"/>
+        </w:rPr>
+        <w:t>/run</w:t>
+      </w:r>
     </w:p>
     <w:p>
       <w:pPr>
@@ -3317,6 +3466,98 @@
     <w:p>
       <w:pPr>
         <w:pStyle w:val="BodyText"/>
+        <w:numPr>
+          <w:ilvl w:val="0"/>
+          <w:numId w:val="18"/>
+        </w:numPr>
+        <w:rPr>
+          <w:rFonts w:asciiTheme="minorHAnsi" w:hAnsiTheme="minorHAnsi" w:cstheme="minorHAnsi"/>
+          <w:b/>
+          <w:sz w:val="22"/>
+          <w:szCs w:val="22"/>
+        </w:rPr>
+      </w:pPr>
+      <w:r>
+        <w:rPr>
+          <w:rFonts w:asciiTheme="minorHAnsi" w:hAnsiTheme="minorHAnsi" w:cstheme="minorHAnsi"/>
+          <w:sz w:val="22"/>
+          <w:szCs w:val="22"/>
+        </w:rPr>
+        <w:t>POST request to get AI review for submission</w:t>
+      </w:r>
+    </w:p>
+    <w:p>
+      <w:pPr>
+        <w:pStyle w:val="BodyText"/>
+        <w:numPr>
+          <w:ilvl w:val="0"/>
+          <w:numId w:val="18"/>
+        </w:numPr>
+        <w:rPr>
+          <w:rFonts w:asciiTheme="minorHAnsi" w:hAnsiTheme="minorHAnsi" w:cstheme="minorHAnsi"/>
+          <w:b/>
+          <w:sz w:val="22"/>
+          <w:szCs w:val="22"/>
+        </w:rPr>
+      </w:pPr>
+      <w:r>
+        <w:rPr>
+          <w:rFonts w:asciiTheme="minorHAnsi" w:hAnsiTheme="minorHAnsi" w:cstheme="minorHAnsi"/>
+          <w:sz w:val="22"/>
+          <w:szCs w:val="22"/>
+        </w:rPr>
+        <w:t>POST request to create problem</w:t>
+      </w:r>
+    </w:p>
+    <w:p>
+      <w:pPr>
+        <w:pStyle w:val="BodyText"/>
+        <w:numPr>
+          <w:ilvl w:val="0"/>
+          <w:numId w:val="18"/>
+        </w:numPr>
+        <w:rPr>
+          <w:rFonts w:asciiTheme="minorHAnsi" w:hAnsiTheme="minorHAnsi" w:cstheme="minorHAnsi"/>
+          <w:b/>
+          <w:sz w:val="22"/>
+          <w:szCs w:val="22"/>
+        </w:rPr>
+      </w:pPr>
+      <w:r>
+        <w:rPr>
+          <w:rFonts w:asciiTheme="minorHAnsi" w:hAnsiTheme="minorHAnsi" w:cstheme="minorHAnsi"/>
+          <w:sz w:val="22"/>
+          <w:szCs w:val="22"/>
+        </w:rPr>
+        <w:t>PUT request to update the problem</w:t>
+      </w:r>
+    </w:p>
+    <w:p>
+      <w:pPr>
+        <w:pStyle w:val="BodyText"/>
+        <w:numPr>
+          <w:ilvl w:val="0"/>
+          <w:numId w:val="18"/>
+        </w:numPr>
+        <w:rPr>
+          <w:rFonts w:asciiTheme="minorHAnsi" w:hAnsiTheme="minorHAnsi" w:cstheme="minorHAnsi"/>
+          <w:b/>
+          <w:sz w:val="22"/>
+          <w:szCs w:val="22"/>
+        </w:rPr>
+      </w:pPr>
+      <w:r>
+        <w:rPr>
+          <w:rFonts w:asciiTheme="minorHAnsi" w:hAnsiTheme="minorHAnsi" w:cstheme="minorHAnsi"/>
+          <w:sz w:val="22"/>
+          <w:szCs w:val="22"/>
+        </w:rPr>
+        <w:t>DELETE request to delete a problem</w:t>
+      </w:r>
+    </w:p>
+    <w:p>
+      <w:pPr>
+        <w:pStyle w:val="BodyText"/>
         <w:rPr>
           <w:rFonts w:asciiTheme="minorHAnsi" w:hAnsiTheme="minorHAnsi" w:cstheme="minorHAnsi"/>
           <w:sz w:val="22"/>
@@ -3440,6 +3681,8 @@
         </w:rPr>
         <w:t>Are subject to strict execution time limits.</w:t>
       </w:r>
+      <w:bookmarkStart w:id="0" w:name="_GoBack"/>
+      <w:bookmarkEnd w:id="0"/>
     </w:p>
     <w:p/>
     <w:p/>

</xml_diff>